<commit_message>
feat: simple, self-contained labs for GenAI for Engineers v2.4
Every lab now works directly on the files in its own data folder: no
extra work folder, no copying between folders and no dependence on
finishing an earlier lab. Lab 2 ships the finished Lab 1 workbook and
Word brief; Lab 6 and Lab 10 ship ready-made decks to improve.

Steps follow the C34 style: a short headline, the exact clicks, what
you should see, and one plain-English prompt (one paste, no blank
lines). Steps without a prompt get a "What you should see" checklist
box on the prompts page instead of a Copy button. Skill installs use
the OneDrive folder-upload route; SKILL.md authoring moves to an
optional Challenge.

Also: Excel desktop works on local files (no OneDrive upload), the
deck compares local upload with OneDrive references, and the v2.3
deck is superseded by v2.4.

Co-Authored-By: Claude Opus 5.5 <noreply@anthropic.com>
</commit_message>
<xml_diff>
--- a/courseware/LP-GenAI for Engineers.docx
+++ b/courseware/LP-GenAI for Engineers.docx
@@ -112,7 +112,7 @@
           <w:color w:val="1F6FEB"/>
           <w:sz w:val="24"/>
         </w:rPr>
-        <w:t>Version 2.3</w:t>
+        <w:t>Version 2.4</w:t>
       </w:r>
     </w:p>
     <w:p>
@@ -213,6 +213,64 @@
                 <w:sz w:val="19"/>
               </w:rPr>
               <w:t>Author</w:t>
+            </w:r>
+          </w:p>
+        </w:tc>
+      </w:tr>
+      <w:tr>
+        <w:tc>
+          <w:tcPr>
+            <w:tcW w:type="dxa" w:w="1152"/>
+          </w:tcPr>
+          <w:p>
+            <w:r/>
+            <w:r>
+              <w:rPr>
+                <w:sz w:val="19"/>
+              </w:rPr>
+              <w:t>2.4</w:t>
+            </w:r>
+          </w:p>
+        </w:tc>
+        <w:tc>
+          <w:tcPr>
+            <w:tcW w:type="dxa" w:w="1656"/>
+          </w:tcPr>
+          <w:p>
+            <w:r/>
+            <w:r>
+              <w:rPr>
+                <w:sz w:val="19"/>
+              </w:rPr>
+              <w:t>19 October 2026</w:t>
+            </w:r>
+          </w:p>
+        </w:tc>
+        <w:tc>
+          <w:tcPr>
+            <w:tcW w:type="dxa" w:w="4896"/>
+          </w:tcPr>
+          <w:p>
+            <w:r/>
+            <w:r>
+              <w:rPr>
+                <w:sz w:val="19"/>
+              </w:rPr>
+              <w:t>Simple, self-contained labs: short steps with one prompt each, and every lab works directly on the files in its own lab folder (no extra folder, no copying, no dependence on earlier labs); files stay local with no OneDrive upload; Word, PowerPoint and Outlook steps upload the local file with + &gt; Upload images and files (paste as fallback); new slide compares local upload with OneDrive / reference. OneDrive remains only for the Excel Skills folder and Agent Builder knowledge.</w:t>
+            </w:r>
+          </w:p>
+        </w:tc>
+        <w:tc>
+          <w:tcPr>
+            <w:tcW w:type="dxa" w:w="1656"/>
+          </w:tcPr>
+          <w:p>
+            <w:r/>
+            <w:r>
+              <w:rPr>
+                <w:sz w:val="19"/>
+              </w:rPr>
+              <w:t>IES Academy</w:t>
             </w:r>
           </w:p>
         </w:tc>
@@ -1901,7 +1959,7 @@
                 <w:b w:val="0"/>
                 <w:sz w:val="19"/>
               </w:rPr>
-              <w:t>Lab 8 (Interactive Filters and Refresh): Use the Dashboard Skill for Filters, Refresh and Safe Reruns</w:t>
+              <w:t>Lab 8 (Interactive Filters and Refresh): Test Dashboard Filters and a Data Refresh</w:t>
             </w:r>
           </w:p>
         </w:tc>

</xml_diff>